<commit_message>
docs: close pre-M4 physical catalogue and prepare calibration
</commit_message>
<xml_diff>
--- a/docs/Sorting_Apocalypse_Systems_MVP_Foundation_Design_and_Progress_v0.4.docx
+++ b/docs/Sorting_Apocalypse_Systems_MVP_Foundation_Design_and_Progress_v0.4.docx
@@ -37,7 +37,7 @@
         <w:pStyle w:val="Small"/>
       </w:pPr>
       <w:r>
-        <w:t>Version 0.4  |  17 October 2026  |  M3 human-promoted / closed</w:t>
+        <w:t>Version 0.4  |  21 October 2026  |  Pre-M4 physical catalogue human-accepted</w:t>
       </w:r>
     </w:p>
     <w:p>
@@ -330,7 +330,7 @@
         <w:pStyle w:val="Small"/>
       </w:pPr>
       <w:r>
-        <w:t>M1/M2 remain HUMAN-PROMOTED / PUBLISHED / CLOSED. M2 publication: 3465098d1910be0bb697416cb4e8bf6d1058cfb8. M3 Kitchen is HUMAN-PROMOTED / CLOSED after independent ACCEPT decisions and successful developer retests of all four UI/input corrections. Publication is authorized; PUBLISHED requires live remote confirmation (§15.3). CF-07 and full-game Ironman durability remain deferred.</w:t>
+        <w:t>M1–M3 remain HUMAN-PROMOTED / PUBLISHED / CLOSED in their accepted scopes. Pre-M4 physical catalogue authoring is HUMAN-ACCEPTED / CLOSED IN PHYSICAL SCOPE (§15.4): 155 active, seven retired, 155 current reviews / zero pending. Publication is authorized and becomes PUBLISHED only after independent live remote verification. Utility/Bulk calibration is next; M4 Dispatch is NOT IMPLEMENTED. CF-07 and full-game Ironman durability remain deferred.</w:t>
       </w:r>
     </w:p>
     <w:p>
@@ -364,7 +364,7 @@
         <w:ind w:left="144" w:right="144"/>
       </w:pPr>
       <w:r>
-        <w:t>Current position: M3 Kitchen Meal Service is HUMAN-PROMOTED / CLOSED (§15.3). M1/M2 remain published/closed. M4 Expedition Loadout is next, NOT IMPLEMENTED, including provisional item-specific Bulk authoring. Publication of this close-out requires safe fast-forward and live remote confirmation; see the executor’s final report.</w:t>
+        <w:t>Current position: the 155-item physical catalogue is human-accepted (§15.4); M1–M3 remain closed. Utility/Bulk calibration across retained items and additions is next, before M4 Expedition Loadout/Dispatch, which is NOT IMPLEMENTED. This publication close-out changes documents only; live remote confirmation belongs in the final report.</w:t>
       </w:r>
     </w:p>
     <w:p>
@@ -864,7 +864,7 @@
               <w:pStyle w:val="Small"/>
             </w:pPr>
             <w:r>
-              <w:t>18–22</w:t>
+              <w:t>18–23</w:t>
             </w:r>
           </w:p>
         </w:tc>
@@ -932,7 +932,7 @@
               <w:pStyle w:val="Small"/>
             </w:pPr>
             <w:r>
-              <w:t>23–27</w:t>
+              <w:t>24–28</w:t>
             </w:r>
           </w:p>
         </w:tc>
@@ -1000,7 +1000,7 @@
               <w:pStyle w:val="Small"/>
             </w:pPr>
             <w:r>
-              <w:t>28–34</w:t>
+              <w:t>29–35</w:t>
             </w:r>
           </w:p>
         </w:tc>
@@ -1044,7 +1044,7 @@
               <w:pStyle w:val="Small"/>
             </w:pPr>
             <w:r>
-              <w:t>35–38</w:t>
+              <w:t>36–39</w:t>
             </w:r>
           </w:p>
         </w:tc>
@@ -1085,7 +1085,7 @@
               <w:pStyle w:val="Small"/>
             </w:pPr>
             <w:r>
-              <w:t>39–44</w:t>
+              <w:t>40–45</w:t>
             </w:r>
           </w:p>
         </w:tc>
@@ -1252,7 +1252,7 @@
     </w:p>
     <w:p>
       <w:r>
-        <w:t>v0.1–v0.3 remain preserved editions. v0.3 was published at 2cad0d7 and M2 promotion at 3465098. This same-edition v0.4 close-out uses the verified developer-approved v0.4 master, preserves its Kitchen design and all CF-01–CF-24 obligations, and records M3 acceptance (§15.3). GDD/VDD, historical editions and game source are unchanged by this documentation commit.</w:t>
+        <w:t>v0.1–v0.3 remain preserved editions. This same-edition v0.4 update records accepted M3 (§15.3) and pre-M4 physical catalogue completion (§15.4), retaining all CF-01–CF-24 obligations. GDD/VDD, historical editions, game code and authored item data are unchanged by this documentation commit.</w:t>
       </w:r>
     </w:p>
     <w:p>
@@ -2612,7 +2612,7 @@
     </w:p>
     <w:p>
       <w:r>
-        <w:t>ItemDefinition already exposes primary Utility, destination-specific overrides, Bulk and a separate Storage Category. ItemInstance remains durable physical identity; WorldItem and held/HUD objects are representations. Use the existing contextual Utility path rather than treating Storage Category as a destination’s consumption rule. Current data support does not establish that every scenario item has been economically balanced or validated for the new consumers. [SRC15; GDD §6]</w:t>
+        <w:t>ItemDefinition already exposes primary Utility, destination-specific overrides, Bulk and a separate Storage Category. ItemInstance remains durable physical identity; WorldItem and held/HUD objects are representations. Use the existing contextual Utility path rather than treating Storage Category as a destination’s consumption rule. Current data support does not establish that every scenario item has been economically balanced or validated for the new consumers. [SRC15; GDD §6] The 21 October physical acceptance covers 155 active items; it assigns no new Utility/Bulk values (§15.4).</w:t>
       </w:r>
     </w:p>
     <w:p>
@@ -7672,7 +7672,7 @@
               <w:pStyle w:val="TableHead"/>
             </w:pPr>
             <w:r>
-              <w:t>Status at 17 October 2026</w:t>
+              <w:t>Status at 21 October 2026</w:t>
             </w:r>
           </w:p>
         </w:tc>
@@ -8151,7 +8151,7 @@
               <w:pStyle w:val="TableText"/>
             </w:pPr>
             <w:r>
-              <w:t>Next: provisional item-specific Bulk authoring and carrying/handling pressure; Receiving/Loadout effects. Values and overfill remain open.</w:t>
+              <w:t>Next: Utility/Bulk calibration for all 155 items (§15.4). M4 remains later; overfill open.</w:t>
             </w:r>
           </w:p>
         </w:tc>
@@ -8289,6 +8289,51 @@
       <w:pPr/>
       <w:r>
         <w:t>The developer successfully retested all four corrections: both Kitchen lanes red for unrelated items; no movement after W is released during a panel; zoning-first ESC; redundant close hints removed. M3 is HUMAN-PROMOTED / CLOSED. Publication is authorized with this docs-only commit; PUBLISHED applies only after independent live remote confirmation in the executor’s final report. Detailed acceptance and retained failures: docs/testing/m3-kitchen-meal-service-validation-2026-10-17.md. M1/M2 stay closed. No final economy, item-specific Bulk balance or full-game Ironman claim is made.</w:t>
+      </w:r>
+    </w:p>
+    <w:p>
+      <w:pPr>
+        <w:pStyle w:val="Heading2"/>
+        <w:pageBreakBefore/>
+      </w:pPr>
+      <w:r>
+        <w:t>15.4 Pre M4 physical catalogue acceptance and publication</w:t>
+      </w:r>
+    </w:p>
+    <w:p>
+      <w:pPr/>
+      <w:r>
+        <w:t>21 October 2026: HUMAN-ACCEPTED / CLOSED IN PHYSICAL SCOPE. The developer reviewed all 155 active items (35 retained + 120 additions), then accepted five scale corrections and three intentional Footprint exceptions. All 155 physical reviews are current; zero are pending. Seven retired IDs stay reserved and excluded: 005, 023, 024, 034, 036, 037, 042 (loot_000 prefix). All 162 source models remain on disk; old Gloves/Pants 034/036 were retired, not repaired.</w:t>
+      </w:r>
+    </w:p>
+    <w:p>
+      <w:pPr/>
+      <w:r>
+        <w:t>Saved names, canonical +Z Front/pose, Footprints and stack/support decisions are authority. Tracked visual_scale carries 025 = 1.50 and 027/075/129/141 = 1.20. Retain 027 at 1×1 despite 105.225×105.291 mm horizontal bounds; centered overhang is about 2.6 mm per side. Retain 154/155 at 3×4 despite widths 348.588/359.252 mm against 300 mm reserved. General warnings remain; acceptance does not certify every neighboring placement.</w:t>
+      </w:r>
+    </w:p>
+    <w:p>
+      <w:pPr/>
+      <w:r>
+        <w:t>folded_clothing revision 1 is approved for exactly 152–155 and bypasses no support, horizontal-fit or clearance rule. Separately confirmed source changes 008/009/010/043/044 retain old/current hashes and provenance. These are distinct from the five scaled items. 019 is now Cola Can, retaining Hydration +3; its old name debt is resolved. Pickaxe 108 / SM_Pickaxe_03.glb retains its co-located-LOD representation caveat. CF-07 and certificate-store diagnostics remain separate debt.</w:t>
+      </w:r>
+    </w:p>
+    <w:p>
+      <w:pPr/>
+      <w:r>
+        <w:t>Controlled physical/Receiving/continuation proof is attributed to the 20–21 October executor record, not rerun for publication. The final reconciliation reports seven passing focused checks and unchanged definitions/sources. Normal recurring M3 content remains the retained 35-item pool with approved placeholder substitutions; additions are controlled-test content, not new normal inflow. Original M3 design tables in §20 retain dated history.</w:t>
+      </w:r>
+    </w:p>
+    <w:p>
+      <w:pPr/>
+      <w:r>
+        <w:t>Next is Utility/Bulk calibration for retained items AND additions, using stable IDs and developer reference/ranking guidance. New-item None/0 Utility and Bulk 1 remain temporary; existing Utility and player capacity 10 are unchanged. Player Bulk 15 is an approved later target, not implemented. Per-scavenger 25 Bulk and 5/6/3/4/4 requirements are earlier provisional references to recheck, not shipped M4 values. No Dispatch, final economy or M4 promotion is implied.</w:t>
+      </w:r>
+    </w:p>
+    <w:p>
+      <w:pPr/>
+      <w:r>
+        <w:t>Publication lineage: 53805a9 → 5faa40b → 170ea01 → fe85aa9 → accepted candidate 6040edeec9884b5a31ef88e368be124b85388deb → at most one documentation commit. Safe fast-forward and normal push are authorized; mark PUBLISHED only after independent live remote SHA verification. Evidence: docs/testing/pre-m4-catalogue-expansion-validation-2026-10-20.md, final acceptance/publication addenda. No Godot run, save operation, source cleanup or asset redistribution accompanies this close-out.</w:t>
       </w:r>
     </w:p>
     <w:p>
@@ -9279,7 +9324,7 @@
               <w:pStyle w:val="TableText"/>
             </w:pPr>
             <w:r>
-              <w:t>Gloves loot_000034 and Pants loot_000036 remain blocked. Current pool is 40 eligible of 42 definitions; Fuel is reconciled/eligible.</w:t>
+              <w:t>Historical 42 definitions / 40 eligible is superseded: 155 active / seven retired, 155 current physical reviews. Gloves 034/Pants 036 are retired, not repaired; Fuel remains eligible. [§15.4]</w:t>
             </w:r>
           </w:p>
         </w:tc>
@@ -9300,7 +9345,7 @@
               <w:pStyle w:val="TableText"/>
             </w:pPr>
             <w:r>
-              <w:t>Separate source/pose/content approval. Scenarios must not silently enable blocked items.</w:t>
+              <w:t>Never recycle retired IDs or reintroduce excluded sources through scenarios. Retain retirement history; any new source/content approval is separate.</w:t>
             </w:r>
           </w:p>
         </w:tc>
@@ -10407,7 +10452,7 @@
     </w:p>
     <w:p>
       <w:r>
-        <w:t>M1/M2 remain HUMAN-PROMOTED / PUBLISHED / CLOSED. M3 Kitchen is HUMAN-PROMOTED / CLOSED (§15.3), retaining approved v0.2 design, loot_000019 Hydration +3/name debt and no M2-save migration. M4 Expedition Loadout is next, NOT IMPLEMENTED. General P01 and final loadout overfill remain open.</w:t>
+        <w:t>M1–M3 remain HUMAN-PROMOTED / PUBLISHED / CLOSED. Pre-M4 physical authoring is human-accepted (§15.4), including Cola Can 019 / Hydration +3 and seven permanent retirements. Utility/Bulk calibration is next across retained and new items; M4 Expedition Loadout/Dispatch is NOT IMPLEMENTED. General P01 and final loadout overfill remain open.</w:t>
       </w:r>
     </w:p>
     <w:tbl>
@@ -11022,7 +11067,7 @@
           </w:tcPr>
           <w:p>
             <w:r>
-              <w:t>ACCEPTED provisional fixture: four 16-item hauls/day; loot_000019 Hydration +3/name debt; all current initial Bulk 1. M4 item-specific authoring remains (§17).</w:t>
+              <w:t>Accepted provisional fixture: four 16-item hauls/day; retained 35-item pool and approved retired-placeholder substitutions. Cola Can 019 retains Hydration +3; Bulk remains 1. Expanded-catalogue calibration is next (§15.4).</w:t>
             </w:r>
           </w:p>
         </w:tc>
@@ -11039,7 +11084,7 @@
         <w:pStyle w:val="Small"/>
       </w:pPr>
       <w:r>
-        <w:t>M4 requires provisional item-specific Bulk authoring, including player carrying/handling pressure, Receiving manifest feasibility and Expedition Loadout capacity effects. Current tested initial Bulk values are all 1; no numerical rebalance is settled here. Eventual loadout overfill remains open. No M4 implementation is authorized by this close-out; full-game continuous Ironman remains NOT IMPLEMENTED.</w:t>
+        <w:t>Next numerical work includes item-specific Utility and Bulk across all 155 items, with player carrying/handling pressure, Receiving feasibility and later Expedition Loadout capacity effects. Current capacity remains 10; the approved later player target of 15 is not implemented. Existing values and temporary new-item None/0 Utility and Bulk 1 remain unchanged. Earlier per-scavenger 25 Bulk and 5/6/3/4/4 requirements need rechecking against the expanded catalogue. Overfill remains open. M4 Dispatch and full-game continuous Ironman remain NOT IMPLEMENTED.</w:t>
       </w:r>
     </w:p>
     <w:p>
@@ -15398,7 +15443,7 @@
         <w:pStyle w:val="Small"/>
       </w:pPr>
       <w:r>
-        <w:t>Explicit authoring debt: loot_000019 has Hydration Storage Category and receives Hydration +3. Its display name “Food Can” is misleading and should later be renamed toward “Soda Can,” but renaming is OUT OF SCOPE for M3. No Food override, rename, recategorization or asset replacement is approved. [D23]</w:t>
+        <w:t>Historical M3 name debt: loot_000019 retained Hydration Storage Category / Hydration +3 while its misleading Food Can name was out of scope for M3. The 21 October developer physical authoring renamed it Cola Can; that display-name debt is now resolved. Utility/category are unchanged. [D23; §15.4]</w:t>
       </w:r>
     </w:p>
     <w:p>
@@ -16466,7 +16511,7 @@
     <w:p>
       <w:pPr/>
       <w:r>
-        <w:t>v0.1–v0.3 remain historical editions. v0.3 recorded M2 publication; v0.4 now records accepted M3 (§15.3), retaining its approved provisional authored values. General P01, item-specific Bulk balance and final M4 loadout overfill remain unsettled.</w:t>
+        <w:t>v0.1–v0.3 remain historical editions. v0.4 records accepted M3 (§15.3) and pre-M4 physical catalogue completion (§15.4). Original M3 Utility/basket tables retain dated design history; approved retirement substitutions and the current 155-item catalogue are recorded in §15.4. General P01, numerical calibration and final M4 overfill remain unsettled.</w:t>
       </w:r>
     </w:p>
     <w:tbl>
@@ -18971,7 +19016,7 @@
     </w:p>
     <w:p>
       <w:r>
-        <w:t>Edition v0.4 retains all approved contracts, §§18–19 and CF-01–CF-24, and records M3 acceptance without changing provisional meal/haul/Utility values or loot_000019 Hydration +3/name debt. M4 Bulk authoring and carrying pressure are next requirements, without assigned values. No game tests, production changes or save operations are performed by this documentation task.</w:t>
+        <w:t>Edition v0.4 retains all approved contracts, §§18–19 and CF-01–CF-24. The 21 October close-out records 155 human-accepted physical items, seven retirements, accepted scale/Footprint exceptions and resolved Cola Can name debt (§15.4), without numerical calibration or M4 implementation. No game test, production change or save operation is performed by this documentation task.</w:t>
       </w:r>
     </w:p>
     <w:sectPr>
@@ -19000,7 +19045,7 @@
       <w:spacing w:before="0"/>
     </w:pPr>
     <w:r>
-      <w:t>Foundation Design &amp; Progress v0.4  |  17 October 2026</w:t>
+      <w:t>Foundation Design &amp; Progress v0.4  |  21 October 2026</w:t>
     </w:r>
     <w:r>
       <w:tab/>

</xml_diff>